<commit_message>
feat: refresh two-day courseware and deliverables
Align the course materials, generated deliverables, labs, and README with the two-day WSQ release.
</commit_message>
<xml_diff>
--- a/courseware/LP-Business Process Automation with Power Automate and Copilot Studio Agents.docx
+++ b/courseware/LP-Business Process Automation with Power Automate and Copilot Studio Agents.docx
@@ -107,7 +107,7 @@
           <w:color w:val="555B66"/>
           <w:sz w:val="24"/>
         </w:rPr>
-        <w:t>Duration: 3 Days  ·  9:00am – 6:00pm</w:t>
+        <w:t>Duration: 2 Days  ·  9:00am – 6:00pm</w:t>
       </w:r>
     </w:p>
     <w:p>
@@ -167,7 +167,7 @@
           <w:color w:val="1F6FEB"/>
           <w:sz w:val="24"/>
         </w:rPr>
-        <w:t>Version 2.0</w:t>
+        <w:t>Version 3.0</w:t>
       </w:r>
     </w:p>
     <w:p>
@@ -387,6 +387,64 @@
           </w:p>
         </w:tc>
       </w:tr>
+      <w:tr>
+        <w:tc>
+          <w:tcPr>
+            <w:tcW w:type="dxa" w:w="2160"/>
+          </w:tcPr>
+          <w:p>
+            <w:r/>
+            <w:r>
+              <w:rPr>
+                <w:sz w:val="19"/>
+              </w:rPr>
+              <w:t>3.0</w:t>
+            </w:r>
+          </w:p>
+        </w:tc>
+        <w:tc>
+          <w:tcPr>
+            <w:tcW w:type="dxa" w:w="2160"/>
+          </w:tcPr>
+          <w:p>
+            <w:r/>
+            <w:r>
+              <w:rPr>
+                <w:sz w:val="19"/>
+              </w:rPr>
+              <w:t>3 Jul 2026</w:t>
+            </w:r>
+          </w:p>
+        </w:tc>
+        <w:tc>
+          <w:tcPr>
+            <w:tcW w:type="dxa" w:w="2160"/>
+          </w:tcPr>
+          <w:p>
+            <w:r/>
+            <w:r>
+              <w:rPr>
+                <w:sz w:val="19"/>
+              </w:rPr>
+              <w:t>Course restructured from 3 days to 2 days — Day 1: Power Automate, Day 2: Copilot Studio agents ending with the assessment block (WA 1 hr + PP 1 hr, 4:00-6:00pm). Modules 4-5 and Labs 12-16 retired; slide mapping updated for the 86-slide v3 deck.</w:t>
+            </w:r>
+          </w:p>
+        </w:tc>
+        <w:tc>
+          <w:tcPr>
+            <w:tcW w:type="dxa" w:w="2160"/>
+          </w:tcPr>
+          <w:p>
+            <w:r/>
+            <w:r>
+              <w:rPr>
+                <w:sz w:val="19"/>
+              </w:rPr>
+              <w:t>Course Development Team</w:t>
+            </w:r>
+          </w:p>
+        </w:tc>
+      </w:tr>
     </w:tbl>
     <w:p>
       <w:r>
@@ -430,7 +488,7 @@
     </w:p>
     <w:p>
       <w:r>
-        <w:t>This 3-day, hands-on WSQ course teaches participants to automate real business processes by combining Microsoft Power Automate flows with AI agents built in Microsoft Copilot Studio. Every topic follows a concept → demonstration → hands-on lab pattern; participants finish with working automations, a capstone project of their own, and sit the WSQ assessment on Day 3.</w:t>
+        <w:t>This 2-day, hands-on WSQ course teaches participants to automate real business processes by combining Microsoft Power Automate flows with AI agents built in Microsoft Copilot Studio. Day 1 covers workflow automation concepts and Power Automate; Day 2 covers business agents in Copilot Studio and connecting them to flows. Every topic follows a concept → demonstration → hands-on lab pattern; participants finish with working automations and sit the WSQ assessment at the end of Day 2.</w:t>
       </w:r>
     </w:p>
     <w:tbl>
@@ -543,7 +601,7 @@
               <w:rPr>
                 <w:sz w:val="20"/>
               </w:rPr>
-              <w:t>3 Days (9:00am – 6:00pm), incl. 1-hour lunch and tea breaks; assessment on Day 3, 4:00 – 6:00pm</w:t>
+              <w:t>2 Days (9:00am – 6:00pm), incl. 1-hour lunch and tea breaks; assessment on Day 2, 4:00 – 6:00pm</w:t>
             </w:r>
           </w:p>
         </w:tc>
@@ -671,7 +729,7 @@
               <w:rPr>
                 <w:sz w:val="20"/>
               </w:rPr>
-              <w:t>17 step-by-step labs across 3 days, plus 5 concept modules</w:t>
+              <w:t>12 step-by-step labs across 2 days (Labs 0–11), plus 3 concept modules</w:t>
             </w:r>
           </w:p>
         </w:tc>
@@ -703,7 +761,7 @@
               <w:rPr>
                 <w:sz w:val="20"/>
               </w:rPr>
-              <w:t>Written Assessment (SAQ) 1 hr + Practical Performance (PP) 1 hr — Day 3, 4:00 – 6:00pm, open book</w:t>
+              <w:t>Written Assessment (SAQ) 1 hr + Practical Performance (PP) 1 hr — Day 2, 4:00 – 6:00pm, open book</w:t>
             </w:r>
           </w:p>
         </w:tc>
@@ -759,15 +817,7 @@
         <w:pStyle w:val="ListBullet"/>
       </w:pPr>
       <w:r>
-        <w:t>Orchestrate complete end-to-end workflows for sales, finance, procurement, and order processing.</w:t>
-      </w:r>
-    </w:p>
-    <w:p>
-      <w:pPr>
-        <w:pStyle w:val="ListBullet"/>
-      </w:pPr>
-      <w:r>
-        <w:t>Design, build, and present an original end-to-end automation in a capstone project.</w:t>
+        <w:t>Combine agents and flows into complete end-to-end business automations (e.g. procurement request handling).</w:t>
       </w:r>
     </w:p>
     <w:p>
@@ -780,7 +830,7 @@
     </w:p>
     <w:p>
       <w:r>
-        <w:t>The Slides column maps each session to the matching slides in the facilitator deck (facilitator-slides.pptx, 108 slides) so trainers can pace delivery against the deck.</w:t>
+        <w:t>The Slides column maps each session to the matching slides in the facilitator deck (Business Process Automation with Power Automate and Copilot Studio Agents-v3.pptx, 86 slides) so trainers can pace delivery against the deck.</w:t>
       </w:r>
     </w:p>
     <w:p>
@@ -1923,12 +1973,12 @@
         <w:pStyle w:val="Heading2"/>
       </w:pPr>
       <w:r>
-        <w:t>Day 2 — Building Business Agents with Copilot Studio</w:t>
+        <w:t>Day 2 — Building Business Agents with Copilot Studio &amp; Assessment</w:t>
       </w:r>
     </w:p>
     <w:p>
       <w:r>
-        <w:t>Agents, knowledge/RAG, tools, and agent + flow.</w:t>
+        <w:t>Agents, knowledge/RAG, tools, agent + flow end-to-end, then sit the assessment.</w:t>
       </w:r>
     </w:p>
     <w:tbl>
@@ -2130,7 +2180,7 @@
               <w:rPr>
                 <w:sz w:val="19"/>
               </w:rPr>
-              <w:t>9:15 – 10:15</w:t>
+              <w:t>9:15 – 10:00</w:t>
             </w:r>
           </w:p>
         </w:tc>
@@ -2145,7 +2195,7 @@
               <w:rPr>
                 <w:sz w:val="19"/>
               </w:rPr>
-              <w:t>60 min</w:t>
+              <w:t>45 min</w:t>
             </w:r>
           </w:p>
         </w:tc>
@@ -2200,6 +2250,84 @@
         <w:tc>
           <w:tcPr>
             <w:tcW w:type="dxa" w:w="1520"/>
+            <w:shd w:val="clear" w:color="auto" w:fill="E8F7EE"/>
+          </w:tcPr>
+          <w:p>
+            <w:r/>
+            <w:r>
+              <w:rPr>
+                <w:sz w:val="19"/>
+              </w:rPr>
+              <w:t>10:00 – 10:40</w:t>
+            </w:r>
+          </w:p>
+        </w:tc>
+        <w:tc>
+          <w:tcPr>
+            <w:tcW w:type="dxa" w:w="1000"/>
+            <w:shd w:val="clear" w:color="auto" w:fill="E8F7EE"/>
+          </w:tcPr>
+          <w:p>
+            <w:r/>
+            <w:r>
+              <w:rPr>
+                <w:sz w:val="19"/>
+              </w:rPr>
+              <w:t>40 min</w:t>
+            </w:r>
+          </w:p>
+        </w:tc>
+        <w:tc>
+          <w:tcPr>
+            <w:tcW w:type="dxa" w:w="1728"/>
+            <w:shd w:val="clear" w:color="auto" w:fill="E8F7EE"/>
+          </w:tcPr>
+          <w:p>
+            <w:r/>
+            <w:r>
+              <w:rPr>
+                <w:b/>
+                <w:sz w:val="19"/>
+              </w:rPr>
+              <w:t>Lab 6: Create Your First Agent — instructions, knowledge, Test pane</w:t>
+            </w:r>
+          </w:p>
+        </w:tc>
+        <w:tc>
+          <w:tcPr>
+            <w:tcW w:type="dxa" w:w="1760"/>
+            <w:shd w:val="clear" w:color="auto" w:fill="E8F7EE"/>
+          </w:tcPr>
+          <w:p>
+            <w:r/>
+            <w:r>
+              <w:rPr>
+                <w:sz w:val="19"/>
+              </w:rPr>
+              <w:t>Hands-on lab</w:t>
+            </w:r>
+          </w:p>
+        </w:tc>
+        <w:tc>
+          <w:tcPr>
+            <w:tcW w:type="dxa" w:w="1120"/>
+            <w:shd w:val="clear" w:color="auto" w:fill="E8F7EE"/>
+          </w:tcPr>
+          <w:p>
+            <w:r/>
+            <w:r>
+              <w:rPr>
+                <w:sz w:val="19"/>
+              </w:rPr>
+              <w:t>65–66</w:t>
+            </w:r>
+          </w:p>
+        </w:tc>
+      </w:tr>
+      <w:tr>
+        <w:tc>
+          <w:tcPr>
+            <w:tcW w:type="dxa" w:w="1520"/>
             <w:shd w:val="clear" w:color="auto" w:fill="FFF4E5"/>
           </w:tcPr>
           <w:p>
@@ -2208,7 +2336,7 @@
               <w:rPr>
                 <w:sz w:val="19"/>
               </w:rPr>
-              <w:t>10:15 – 10:30</w:t>
+              <w:t>10:40 – 10:55</w:t>
             </w:r>
           </w:p>
         </w:tc>
@@ -2285,7 +2413,7 @@
               <w:rPr>
                 <w:sz w:val="19"/>
               </w:rPr>
-              <w:t>10:30 – 11:15</w:t>
+              <w:t>10:55 – 11:35</w:t>
             </w:r>
           </w:p>
         </w:tc>
@@ -2300,85 +2428,7 @@
               <w:rPr>
                 <w:sz w:val="19"/>
               </w:rPr>
-              <w:t>45 min</w:t>
-            </w:r>
-          </w:p>
-        </w:tc>
-        <w:tc>
-          <w:tcPr>
-            <w:tcW w:type="dxa" w:w="1728"/>
-            <w:shd w:val="clear" w:color="auto" w:fill="E8F7EE"/>
-          </w:tcPr>
-          <w:p>
-            <w:r/>
-            <w:r>
-              <w:rPr>
-                <w:b/>
-                <w:sz w:val="19"/>
-              </w:rPr>
-              <w:t>Lab 6: Create Your First Agent — instructions, knowledge, Test pane</w:t>
-            </w:r>
-          </w:p>
-        </w:tc>
-        <w:tc>
-          <w:tcPr>
-            <w:tcW w:type="dxa" w:w="1760"/>
-            <w:shd w:val="clear" w:color="auto" w:fill="E8F7EE"/>
-          </w:tcPr>
-          <w:p>
-            <w:r/>
-            <w:r>
-              <w:rPr>
-                <w:sz w:val="19"/>
-              </w:rPr>
-              <w:t>Hands-on lab</w:t>
-            </w:r>
-          </w:p>
-        </w:tc>
-        <w:tc>
-          <w:tcPr>
-            <w:tcW w:type="dxa" w:w="1120"/>
-            <w:shd w:val="clear" w:color="auto" w:fill="E8F7EE"/>
-          </w:tcPr>
-          <w:p>
-            <w:r/>
-            <w:r>
-              <w:rPr>
-                <w:sz w:val="19"/>
-              </w:rPr>
-              <w:t>65–66</w:t>
-            </w:r>
-          </w:p>
-        </w:tc>
-      </w:tr>
-      <w:tr>
-        <w:tc>
-          <w:tcPr>
-            <w:tcW w:type="dxa" w:w="1520"/>
-            <w:shd w:val="clear" w:color="auto" w:fill="E8F7EE"/>
-          </w:tcPr>
-          <w:p>
-            <w:r/>
-            <w:r>
-              <w:rPr>
-                <w:sz w:val="19"/>
-              </w:rPr>
-              <w:t>11:15 – 12:00</w:t>
-            </w:r>
-          </w:p>
-        </w:tc>
-        <w:tc>
-          <w:tcPr>
-            <w:tcW w:type="dxa" w:w="1000"/>
-            <w:shd w:val="clear" w:color="auto" w:fill="E8F7EE"/>
-          </w:tcPr>
-          <w:p>
-            <w:r/>
-            <w:r>
-              <w:rPr>
-                <w:sz w:val="19"/>
-              </w:rPr>
-              <w:t>45 min</w:t>
+              <w:t>40 min</w:t>
             </w:r>
           </w:p>
         </w:tc>
@@ -2441,7 +2491,7 @@
               <w:rPr>
                 <w:sz w:val="19"/>
               </w:rPr>
-              <w:t>12:00 – 12:45</w:t>
+              <w:t>11:35 – 12:15</w:t>
             </w:r>
           </w:p>
         </w:tc>
@@ -2456,7 +2506,7 @@
               <w:rPr>
                 <w:sz w:val="19"/>
               </w:rPr>
-              <w:t>45 min</w:t>
+              <w:t>40 min</w:t>
             </w:r>
           </w:p>
         </w:tc>
@@ -2519,7 +2569,7 @@
               <w:rPr>
                 <w:sz w:val="19"/>
               </w:rPr>
-              <w:t>12:45 – 1:45</w:t>
+              <w:t>12:15 – 1:15</w:t>
             </w:r>
           </w:p>
         </w:tc>
@@ -2596,7 +2646,7 @@
               <w:rPr>
                 <w:sz w:val="19"/>
               </w:rPr>
-              <w:t>1:45 – 2:45</w:t>
+              <w:t>1:15 – 2:00</w:t>
             </w:r>
           </w:p>
         </w:tc>
@@ -2611,7 +2661,7 @@
               <w:rPr>
                 <w:sz w:val="19"/>
               </w:rPr>
-              <w:t>60 min</w:t>
+              <w:t>45 min</w:t>
             </w:r>
           </w:p>
         </w:tc>
@@ -2674,7 +2724,7 @@
               <w:rPr>
                 <w:sz w:val="19"/>
               </w:rPr>
-              <w:t>2:45 – 3:45</w:t>
+              <w:t>2:00 – 2:50</w:t>
             </w:r>
           </w:p>
         </w:tc>
@@ -2689,7 +2739,7 @@
               <w:rPr>
                 <w:sz w:val="19"/>
               </w:rPr>
-              <w:t>60 min</w:t>
+              <w:t>50 min</w:t>
             </w:r>
           </w:p>
         </w:tc>
@@ -2705,7 +2755,7 @@
                 <w:b/>
                 <w:sz w:val="19"/>
               </w:rPr>
-              <w:t>Lab 10: Procurement Request Workflow — agent calls a flow</w:t>
+              <w:t>Lab 10: Procurement Request Workflow — agent calls a flow, log + notify, test end-to-end</w:t>
             </w:r>
           </w:p>
         </w:tc>
@@ -2752,676 +2802,7 @@
               <w:rPr>
                 <w:sz w:val="19"/>
               </w:rPr>
-              <w:t>3:45 – 4:00</w:t>
-            </w:r>
-          </w:p>
-        </w:tc>
-        <w:tc>
-          <w:tcPr>
-            <w:tcW w:type="dxa" w:w="1000"/>
-            <w:shd w:val="clear" w:color="auto" w:fill="FFF4E5"/>
-          </w:tcPr>
-          <w:p>
-            <w:r/>
-            <w:r>
-              <w:rPr>
-                <w:sz w:val="19"/>
-              </w:rPr>
-              <w:t>15 min</w:t>
-            </w:r>
-          </w:p>
-        </w:tc>
-        <w:tc>
-          <w:tcPr>
-            <w:tcW w:type="dxa" w:w="1728"/>
-            <w:shd w:val="clear" w:color="auto" w:fill="FFF4E5"/>
-          </w:tcPr>
-          <w:p>
-            <w:r/>
-            <w:r>
-              <w:rPr>
-                <w:sz w:val="19"/>
-              </w:rPr>
-              <w:t>Tea break</w:t>
-            </w:r>
-          </w:p>
-        </w:tc>
-        <w:tc>
-          <w:tcPr>
-            <w:tcW w:type="dxa" w:w="1760"/>
-            <w:shd w:val="clear" w:color="auto" w:fill="FFF4E5"/>
-          </w:tcPr>
-          <w:p>
-            <w:r/>
-            <w:r>
-              <w:rPr>
-                <w:sz w:val="19"/>
-              </w:rPr>
-              <w:t>—</w:t>
-            </w:r>
-          </w:p>
-        </w:tc>
-        <w:tc>
-          <w:tcPr>
-            <w:tcW w:type="dxa" w:w="1120"/>
-            <w:shd w:val="clear" w:color="auto" w:fill="FFF4E5"/>
-          </w:tcPr>
-          <w:p>
-            <w:r/>
-            <w:r>
-              <w:rPr>
-                <w:sz w:val="19"/>
-              </w:rPr>
-              <w:t>—</w:t>
-            </w:r>
-          </w:p>
-        </w:tc>
-      </w:tr>
-      <w:tr>
-        <w:tc>
-          <w:tcPr>
-            <w:tcW w:type="dxa" w:w="1520"/>
-            <w:shd w:val="clear" w:color="auto" w:fill="E8F7EE"/>
-          </w:tcPr>
-          <w:p>
-            <w:r/>
-            <w:r>
-              <w:rPr>
-                <w:sz w:val="19"/>
-              </w:rPr>
-              <w:t>4:00 – 4:45</w:t>
-            </w:r>
-          </w:p>
-        </w:tc>
-        <w:tc>
-          <w:tcPr>
-            <w:tcW w:type="dxa" w:w="1000"/>
-            <w:shd w:val="clear" w:color="auto" w:fill="E8F7EE"/>
-          </w:tcPr>
-          <w:p>
-            <w:r/>
-            <w:r>
-              <w:rPr>
-                <w:sz w:val="19"/>
-              </w:rPr>
-              <w:t>45 min</w:t>
-            </w:r>
-          </w:p>
-        </w:tc>
-        <w:tc>
-          <w:tcPr>
-            <w:tcW w:type="dxa" w:w="1728"/>
-            <w:shd w:val="clear" w:color="auto" w:fill="E8F7EE"/>
-          </w:tcPr>
-          <w:p>
-            <w:r/>
-            <w:r>
-              <w:rPr>
-                <w:b/>
-                <w:sz w:val="19"/>
-              </w:rPr>
-              <w:t>Lab 10 (cont.): log + notify, wire inputs, test end-to-end</w:t>
-            </w:r>
-          </w:p>
-        </w:tc>
-        <w:tc>
-          <w:tcPr>
-            <w:tcW w:type="dxa" w:w="1760"/>
-            <w:shd w:val="clear" w:color="auto" w:fill="E8F7EE"/>
-          </w:tcPr>
-          <w:p>
-            <w:r/>
-            <w:r>
-              <w:rPr>
-                <w:sz w:val="19"/>
-              </w:rPr>
-              <w:t>Hands-on lab</w:t>
-            </w:r>
-          </w:p>
-        </w:tc>
-        <w:tc>
-          <w:tcPr>
-            <w:tcW w:type="dxa" w:w="1120"/>
-            <w:shd w:val="clear" w:color="auto" w:fill="E8F7EE"/>
-          </w:tcPr>
-          <w:p>
-            <w:r/>
-            <w:r>
-              <w:rPr>
-                <w:sz w:val="19"/>
-              </w:rPr>
-              <w:t>70</w:t>
-            </w:r>
-          </w:p>
-        </w:tc>
-      </w:tr>
-      <w:tr>
-        <w:tc>
-          <w:tcPr>
-            <w:tcW w:type="dxa" w:w="1520"/>
-            <w:shd w:val="clear" w:color="auto" w:fill="E8F7EE"/>
-          </w:tcPr>
-          <w:p>
-            <w:r/>
-            <w:r>
-              <w:rPr>
-                <w:sz w:val="19"/>
-              </w:rPr>
-              <w:t>4:45 – 5:30</w:t>
-            </w:r>
-          </w:p>
-        </w:tc>
-        <w:tc>
-          <w:tcPr>
-            <w:tcW w:type="dxa" w:w="1000"/>
-            <w:shd w:val="clear" w:color="auto" w:fill="E8F7EE"/>
-          </w:tcPr>
-          <w:p>
-            <w:r/>
-            <w:r>
-              <w:rPr>
-                <w:sz w:val="19"/>
-              </w:rPr>
-              <w:t>45 min</w:t>
-            </w:r>
-          </w:p>
-        </w:tc>
-        <w:tc>
-          <w:tcPr>
-            <w:tcW w:type="dxa" w:w="1728"/>
-            <w:shd w:val="clear" w:color="auto" w:fill="E8F7EE"/>
-          </w:tcPr>
-          <w:p>
-            <w:r/>
-            <w:r>
-              <w:rPr>
-                <w:b/>
-                <w:sz w:val="19"/>
-              </w:rPr>
-              <w:t>Lab 11: Automated Response Generation (AI prompts)</w:t>
-            </w:r>
-          </w:p>
-        </w:tc>
-        <w:tc>
-          <w:tcPr>
-            <w:tcW w:type="dxa" w:w="1760"/>
-            <w:shd w:val="clear" w:color="auto" w:fill="E8F7EE"/>
-          </w:tcPr>
-          <w:p>
-            <w:r/>
-            <w:r>
-              <w:rPr>
-                <w:sz w:val="19"/>
-              </w:rPr>
-              <w:t>Hands-on lab</w:t>
-            </w:r>
-          </w:p>
-        </w:tc>
-        <w:tc>
-          <w:tcPr>
-            <w:tcW w:type="dxa" w:w="1120"/>
-            <w:shd w:val="clear" w:color="auto" w:fill="E8F7EE"/>
-          </w:tcPr>
-          <w:p>
-            <w:r/>
-            <w:r>
-              <w:rPr>
-                <w:sz w:val="19"/>
-              </w:rPr>
-              <w:t>71–72</w:t>
-            </w:r>
-          </w:p>
-        </w:tc>
-      </w:tr>
-      <w:tr>
-        <w:tc>
-          <w:tcPr>
-            <w:tcW w:type="dxa" w:w="1520"/>
-            <w:shd w:val="clear" w:color="auto" w:fill="EAF1FF"/>
-          </w:tcPr>
-          <w:p>
-            <w:r/>
-            <w:r>
-              <w:rPr>
-                <w:sz w:val="19"/>
-              </w:rPr>
-              <w:t>5:30 – 6:00</w:t>
-            </w:r>
-          </w:p>
-        </w:tc>
-        <w:tc>
-          <w:tcPr>
-            <w:tcW w:type="dxa" w:w="1000"/>
-            <w:shd w:val="clear" w:color="auto" w:fill="EAF1FF"/>
-          </w:tcPr>
-          <w:p>
-            <w:r/>
-            <w:r>
-              <w:rPr>
-                <w:sz w:val="19"/>
-              </w:rPr>
-              <w:t>30 min</w:t>
-            </w:r>
-          </w:p>
-        </w:tc>
-        <w:tc>
-          <w:tcPr>
-            <w:tcW w:type="dxa" w:w="1728"/>
-            <w:shd w:val="clear" w:color="auto" w:fill="EAF1FF"/>
-          </w:tcPr>
-          <w:p>
-            <w:r/>
-            <w:r>
-              <w:rPr>
-                <w:b/>
-                <w:sz w:val="19"/>
-              </w:rPr>
-              <w:t>Testing &amp; debugging agents + Day 2 recap &amp; Q&amp;A</w:t>
-            </w:r>
-          </w:p>
-        </w:tc>
-        <w:tc>
-          <w:tcPr>
-            <w:tcW w:type="dxa" w:w="1760"/>
-            <w:shd w:val="clear" w:color="auto" w:fill="EAF1FF"/>
-          </w:tcPr>
-          <w:p>
-            <w:r/>
-            <w:r>
-              <w:rPr>
-                <w:sz w:val="19"/>
-              </w:rPr>
-              <w:t>Facilitated discussion</w:t>
-            </w:r>
-          </w:p>
-        </w:tc>
-        <w:tc>
-          <w:tcPr>
-            <w:tcW w:type="dxa" w:w="1120"/>
-            <w:shd w:val="clear" w:color="auto" w:fill="EAF1FF"/>
-          </w:tcPr>
-          <w:p>
-            <w:r/>
-            <w:r>
-              <w:rPr>
-                <w:sz w:val="19"/>
-              </w:rPr>
-              <w:t>72–73</w:t>
-            </w:r>
-          </w:p>
-        </w:tc>
-      </w:tr>
-    </w:tbl>
-    <w:p/>
-    <w:p>
-      <w:pPr>
-        <w:pStyle w:val="Heading2"/>
-      </w:pPr>
-      <w:r>
-        <w:t>Day 3 — End-to-End Automation, Workshop &amp; Assessment</w:t>
-      </w:r>
-    </w:p>
-    <w:p>
-      <w:r>
-        <w:t>Combine agents + flows, build your own, then sit the assessment.</w:t>
-      </w:r>
-    </w:p>
-    <w:tbl>
-      <w:tblPr>
-        <w:tblStyle w:val="TableGrid"/>
-        <w:tblW w:type="auto" w:w="0"/>
-        <w:jc w:val="center"/>
-        <w:tblLook w:firstColumn="1" w:firstRow="1" w:lastColumn="0" w:lastRow="0" w:noHBand="0" w:noVBand="1" w:val="04A0"/>
-        <w:tblBorders>
-          <w:top w:val="single" w:sz="6" w:space="0" w:color="7A8190"/>
-          <w:left w:val="single" w:sz="6" w:space="0" w:color="7A8190"/>
-          <w:bottom w:val="single" w:sz="6" w:space="0" w:color="7A8190"/>
-          <w:right w:val="single" w:sz="6" w:space="0" w:color="7A8190"/>
-          <w:insideH w:val="single" w:sz="6" w:space="0" w:color="7A8190"/>
-          <w:insideV w:val="single" w:sz="6" w:space="0" w:color="7A8190"/>
-        </w:tblBorders>
-      </w:tblPr>
-      <w:tblGrid>
-        <w:gridCol w:w="1728"/>
-        <w:gridCol w:w="1728"/>
-        <w:gridCol w:w="1728"/>
-        <w:gridCol w:w="1728"/>
-        <w:gridCol w:w="1728"/>
-      </w:tblGrid>
-      <w:tr>
-        <w:tc>
-          <w:tcPr>
-            <w:tcW w:type="dxa" w:w="1520"/>
-            <w:shd w:val="clear" w:color="auto" w:fill="1F6FEB"/>
-          </w:tcPr>
-          <w:p>
-            <w:r/>
-            <w:r>
-              <w:rPr>
-                <w:b/>
-                <w:color w:val="FFFFFF"/>
-                <w:sz w:val="19"/>
-              </w:rPr>
-              <w:t>Time</w:t>
-            </w:r>
-          </w:p>
-        </w:tc>
-        <w:tc>
-          <w:tcPr>
-            <w:tcW w:type="dxa" w:w="1000"/>
-            <w:shd w:val="clear" w:color="auto" w:fill="1F6FEB"/>
-          </w:tcPr>
-          <w:p>
-            <w:r/>
-            <w:r>
-              <w:rPr>
-                <w:b/>
-                <w:color w:val="FFFFFF"/>
-                <w:sz w:val="19"/>
-              </w:rPr>
-              <w:t>Duration</w:t>
-            </w:r>
-          </w:p>
-        </w:tc>
-        <w:tc>
-          <w:tcPr>
-            <w:tcW w:type="dxa" w:w="1728"/>
-            <w:shd w:val="clear" w:color="auto" w:fill="1F6FEB"/>
-          </w:tcPr>
-          <w:p>
-            <w:r/>
-            <w:r>
-              <w:rPr>
-                <w:b/>
-                <w:color w:val="FFFFFF"/>
-                <w:sz w:val="19"/>
-              </w:rPr>
-              <w:t>Topic / Activity</w:t>
-            </w:r>
-          </w:p>
-        </w:tc>
-        <w:tc>
-          <w:tcPr>
-            <w:tcW w:type="dxa" w:w="1760"/>
-            <w:shd w:val="clear" w:color="auto" w:fill="1F6FEB"/>
-          </w:tcPr>
-          <w:p>
-            <w:r/>
-            <w:r>
-              <w:rPr>
-                <w:b/>
-                <w:color w:val="FFFFFF"/>
-                <w:sz w:val="19"/>
-              </w:rPr>
-              <w:t>Method</w:t>
-            </w:r>
-          </w:p>
-        </w:tc>
-        <w:tc>
-          <w:tcPr>
-            <w:tcW w:type="dxa" w:w="1120"/>
-            <w:shd w:val="clear" w:color="auto" w:fill="1F6FEB"/>
-          </w:tcPr>
-          <w:p>
-            <w:r/>
-            <w:r>
-              <w:rPr>
-                <w:b/>
-                <w:color w:val="FFFFFF"/>
-                <w:sz w:val="19"/>
-              </w:rPr>
-              <w:t>Slides</w:t>
-            </w:r>
-          </w:p>
-        </w:tc>
-      </w:tr>
-      <w:tr>
-        <w:tc>
-          <w:tcPr>
-            <w:tcW w:type="dxa" w:w="1520"/>
-            <w:shd w:val="clear" w:color="auto" w:fill="EAF1FF"/>
-          </w:tcPr>
-          <w:p>
-            <w:r/>
-            <w:r>
-              <w:rPr>
-                <w:sz w:val="19"/>
-              </w:rPr>
-              <w:t>9:00 – 9:15</w:t>
-            </w:r>
-          </w:p>
-        </w:tc>
-        <w:tc>
-          <w:tcPr>
-            <w:tcW w:type="dxa" w:w="1000"/>
-            <w:shd w:val="clear" w:color="auto" w:fill="EAF1FF"/>
-          </w:tcPr>
-          <w:p>
-            <w:r/>
-            <w:r>
-              <w:rPr>
-                <w:sz w:val="19"/>
-              </w:rPr>
-              <w:t>15 min</w:t>
-            </w:r>
-          </w:p>
-        </w:tc>
-        <w:tc>
-          <w:tcPr>
-            <w:tcW w:type="dxa" w:w="1728"/>
-            <w:shd w:val="clear" w:color="auto" w:fill="EAF1FF"/>
-          </w:tcPr>
-          <w:p>
-            <w:r/>
-            <w:r>
-              <w:rPr>
-                <w:b/>
-                <w:sz w:val="19"/>
-              </w:rPr>
-              <w:t>Day 2 recap &amp; Q&amp;A</w:t>
-            </w:r>
-          </w:p>
-        </w:tc>
-        <w:tc>
-          <w:tcPr>
-            <w:tcW w:type="dxa" w:w="1760"/>
-            <w:shd w:val="clear" w:color="auto" w:fill="EAF1FF"/>
-          </w:tcPr>
-          <w:p>
-            <w:r/>
-            <w:r>
-              <w:rPr>
-                <w:sz w:val="19"/>
-              </w:rPr>
-              <w:t>Facilitated discussion</w:t>
-            </w:r>
-          </w:p>
-        </w:tc>
-        <w:tc>
-          <w:tcPr>
-            <w:tcW w:type="dxa" w:w="1120"/>
-            <w:shd w:val="clear" w:color="auto" w:fill="EAF1FF"/>
-          </w:tcPr>
-          <w:p>
-            <w:r/>
-            <w:r>
-              <w:rPr>
-                <w:sz w:val="19"/>
-              </w:rPr>
-              <w:t>73–74</w:t>
-            </w:r>
-          </w:p>
-        </w:tc>
-      </w:tr>
-      <w:tr>
-        <w:tc>
-          <w:tcPr>
-            <w:tcW w:type="dxa" w:w="1520"/>
-            <w:shd w:val="clear" w:color="auto" w:fill="EAF1FF"/>
-          </w:tcPr>
-          <w:p>
-            <w:r/>
-            <w:r>
-              <w:rPr>
-                <w:sz w:val="19"/>
-              </w:rPr>
-              <w:t>9:15 – 9:45</w:t>
-            </w:r>
-          </w:p>
-        </w:tc>
-        <w:tc>
-          <w:tcPr>
-            <w:tcW w:type="dxa" w:w="1000"/>
-            <w:shd w:val="clear" w:color="auto" w:fill="EAF1FF"/>
-          </w:tcPr>
-          <w:p>
-            <w:r/>
-            <w:r>
-              <w:rPr>
-                <w:sz w:val="19"/>
-              </w:rPr>
-              <w:t>30 min</w:t>
-            </w:r>
-          </w:p>
-        </w:tc>
-        <w:tc>
-          <w:tcPr>
-            <w:tcW w:type="dxa" w:w="1728"/>
-            <w:shd w:val="clear" w:color="auto" w:fill="EAF1FF"/>
-          </w:tcPr>
-          <w:p>
-            <w:r/>
-            <w:r>
-              <w:rPr>
-                <w:b/>
-                <w:sz w:val="19"/>
-              </w:rPr>
-              <w:t>Module 4: End-to-End Orchestration Concepts</w:t>
-            </w:r>
-          </w:p>
-        </w:tc>
-        <w:tc>
-          <w:tcPr>
-            <w:tcW w:type="dxa" w:w="1760"/>
-            <w:shd w:val="clear" w:color="auto" w:fill="EAF1FF"/>
-          </w:tcPr>
-          <w:p>
-            <w:r/>
-            <w:r>
-              <w:rPr>
-                <w:sz w:val="19"/>
-              </w:rPr>
-              <w:t>Lecture &amp; demo</w:t>
-            </w:r>
-          </w:p>
-        </w:tc>
-        <w:tc>
-          <w:tcPr>
-            <w:tcW w:type="dxa" w:w="1120"/>
-            <w:shd w:val="clear" w:color="auto" w:fill="EAF1FF"/>
-          </w:tcPr>
-          <w:p>
-            <w:r/>
-            <w:r>
-              <w:rPr>
-                <w:sz w:val="19"/>
-              </w:rPr>
-              <w:t>75–81</w:t>
-            </w:r>
-          </w:p>
-        </w:tc>
-      </w:tr>
-      <w:tr>
-        <w:tc>
-          <w:tcPr>
-            <w:tcW w:type="dxa" w:w="1520"/>
-            <w:shd w:val="clear" w:color="auto" w:fill="E8F7EE"/>
-          </w:tcPr>
-          <w:p>
-            <w:r/>
-            <w:r>
-              <w:rPr>
-                <w:sz w:val="19"/>
-              </w:rPr>
-              <w:t>9:45 – 10:30</w:t>
-            </w:r>
-          </w:p>
-        </w:tc>
-        <w:tc>
-          <w:tcPr>
-            <w:tcW w:type="dxa" w:w="1000"/>
-            <w:shd w:val="clear" w:color="auto" w:fill="E8F7EE"/>
-          </w:tcPr>
-          <w:p>
-            <w:r/>
-            <w:r>
-              <w:rPr>
-                <w:sz w:val="19"/>
-              </w:rPr>
-              <w:t>45 min</w:t>
-            </w:r>
-          </w:p>
-        </w:tc>
-        <w:tc>
-          <w:tcPr>
-            <w:tcW w:type="dxa" w:w="1728"/>
-            <w:shd w:val="clear" w:color="auto" w:fill="E8F7EE"/>
-          </w:tcPr>
-          <w:p>
-            <w:r/>
-            <w:r>
-              <w:rPr>
-                <w:b/>
-                <w:sz w:val="19"/>
-              </w:rPr>
-              <w:t>Lab 12: Email Enquiry → Excel Logging → Notification</w:t>
-            </w:r>
-          </w:p>
-        </w:tc>
-        <w:tc>
-          <w:tcPr>
-            <w:tcW w:type="dxa" w:w="1760"/>
-            <w:shd w:val="clear" w:color="auto" w:fill="E8F7EE"/>
-          </w:tcPr>
-          <w:p>
-            <w:r/>
-            <w:r>
-              <w:rPr>
-                <w:sz w:val="19"/>
-              </w:rPr>
-              <w:t>Hands-on lab</w:t>
-            </w:r>
-          </w:p>
-        </w:tc>
-        <w:tc>
-          <w:tcPr>
-            <w:tcW w:type="dxa" w:w="1120"/>
-            <w:shd w:val="clear" w:color="auto" w:fill="E8F7EE"/>
-          </w:tcPr>
-          <w:p>
-            <w:r/>
-            <w:r>
-              <w:rPr>
-                <w:sz w:val="19"/>
-              </w:rPr>
-              <w:t>82</w:t>
-            </w:r>
-          </w:p>
-        </w:tc>
-      </w:tr>
-      <w:tr>
-        <w:tc>
-          <w:tcPr>
-            <w:tcW w:type="dxa" w:w="1520"/>
-            <w:shd w:val="clear" w:color="auto" w:fill="FFF4E5"/>
-          </w:tcPr>
-          <w:p>
-            <w:r/>
-            <w:r>
-              <w:rPr>
-                <w:sz w:val="19"/>
-              </w:rPr>
-              <w:t>10:30 – 10:40</w:t>
+              <w:t>2:50 – 3:00</w:t>
             </w:r>
           </w:p>
         </w:tc>
@@ -3498,7 +2879,7 @@
               <w:rPr>
                 <w:sz w:val="19"/>
               </w:rPr>
-              <w:t>10:40 – 11:40</w:t>
+              <w:t>3:00 – 3:30</w:t>
             </w:r>
           </w:p>
         </w:tc>
@@ -3513,7 +2894,7 @@
               <w:rPr>
                 <w:sz w:val="19"/>
               </w:rPr>
-              <w:t>60 min</w:t>
+              <w:t>30 min</w:t>
             </w:r>
           </w:p>
         </w:tc>
@@ -3529,7 +2910,7 @@
                 <w:b/>
                 <w:sz w:val="19"/>
               </w:rPr>
-              <w:t>Lab 13: Invoice Upload → Approval Workflow (file trigger)</w:t>
+              <w:t>Lab 11: Automated Response Generation (AI prompts)</w:t>
             </w:r>
           </w:p>
         </w:tc>
@@ -3559,395 +2940,7 @@
               <w:rPr>
                 <w:sz w:val="19"/>
               </w:rPr>
-              <w:t>83</w:t>
-            </w:r>
-          </w:p>
-        </w:tc>
-      </w:tr>
-      <w:tr>
-        <w:tc>
-          <w:tcPr>
-            <w:tcW w:type="dxa" w:w="1520"/>
-            <w:shd w:val="clear" w:color="auto" w:fill="E8F7EE"/>
-          </w:tcPr>
-          <w:p>
-            <w:r/>
-            <w:r>
-              <w:rPr>
-                <w:sz w:val="19"/>
-              </w:rPr>
-              <w:t>11:40 – 12:40</w:t>
-            </w:r>
-          </w:p>
-        </w:tc>
-        <w:tc>
-          <w:tcPr>
-            <w:tcW w:type="dxa" w:w="1000"/>
-            <w:shd w:val="clear" w:color="auto" w:fill="E8F7EE"/>
-          </w:tcPr>
-          <w:p>
-            <w:r/>
-            <w:r>
-              <w:rPr>
-                <w:sz w:val="19"/>
-              </w:rPr>
-              <w:t>60 min</w:t>
-            </w:r>
-          </w:p>
-        </w:tc>
-        <w:tc>
-          <w:tcPr>
-            <w:tcW w:type="dxa" w:w="1728"/>
-            <w:shd w:val="clear" w:color="auto" w:fill="E8F7EE"/>
-          </w:tcPr>
-          <w:p>
-            <w:r/>
-            <w:r>
-              <w:rPr>
-                <w:b/>
-                <w:sz w:val="19"/>
-              </w:rPr>
-              <w:t>Lab 14: Purchase Request → Manager Approval — build</w:t>
-            </w:r>
-          </w:p>
-        </w:tc>
-        <w:tc>
-          <w:tcPr>
-            <w:tcW w:type="dxa" w:w="1760"/>
-            <w:shd w:val="clear" w:color="auto" w:fill="E8F7EE"/>
-          </w:tcPr>
-          <w:p>
-            <w:r/>
-            <w:r>
-              <w:rPr>
-                <w:sz w:val="19"/>
-              </w:rPr>
-              <w:t>Hands-on lab</w:t>
-            </w:r>
-          </w:p>
-        </w:tc>
-        <w:tc>
-          <w:tcPr>
-            <w:tcW w:type="dxa" w:w="1120"/>
-            <w:shd w:val="clear" w:color="auto" w:fill="E8F7EE"/>
-          </w:tcPr>
-          <w:p>
-            <w:r/>
-            <w:r>
-              <w:rPr>
-                <w:sz w:val="19"/>
-              </w:rPr>
-              <w:t>84</w:t>
-            </w:r>
-          </w:p>
-        </w:tc>
-      </w:tr>
-      <w:tr>
-        <w:tc>
-          <w:tcPr>
-            <w:tcW w:type="dxa" w:w="1520"/>
-            <w:shd w:val="clear" w:color="auto" w:fill="FFF4E5"/>
-          </w:tcPr>
-          <w:p>
-            <w:r/>
-            <w:r>
-              <w:rPr>
-                <w:sz w:val="19"/>
-              </w:rPr>
-              <w:t>12:40 – 1:25</w:t>
-            </w:r>
-          </w:p>
-        </w:tc>
-        <w:tc>
-          <w:tcPr>
-            <w:tcW w:type="dxa" w:w="1000"/>
-            <w:shd w:val="clear" w:color="auto" w:fill="FFF4E5"/>
-          </w:tcPr>
-          <w:p>
-            <w:r/>
-            <w:r>
-              <w:rPr>
-                <w:sz w:val="19"/>
-              </w:rPr>
-              <w:t>45 min</w:t>
-            </w:r>
-          </w:p>
-        </w:tc>
-        <w:tc>
-          <w:tcPr>
-            <w:tcW w:type="dxa" w:w="1728"/>
-            <w:shd w:val="clear" w:color="auto" w:fill="FFF4E5"/>
-          </w:tcPr>
-          <w:p>
-            <w:r/>
-            <w:r>
-              <w:rPr>
-                <w:sz w:val="19"/>
-              </w:rPr>
-              <w:t>Lunch</w:t>
-            </w:r>
-          </w:p>
-        </w:tc>
-        <w:tc>
-          <w:tcPr>
-            <w:tcW w:type="dxa" w:w="1760"/>
-            <w:shd w:val="clear" w:color="auto" w:fill="FFF4E5"/>
-          </w:tcPr>
-          <w:p>
-            <w:r/>
-            <w:r>
-              <w:rPr>
-                <w:sz w:val="19"/>
-              </w:rPr>
-              <w:t>—</w:t>
-            </w:r>
-          </w:p>
-        </w:tc>
-        <w:tc>
-          <w:tcPr>
-            <w:tcW w:type="dxa" w:w="1120"/>
-            <w:shd w:val="clear" w:color="auto" w:fill="FFF4E5"/>
-          </w:tcPr>
-          <w:p>
-            <w:r/>
-            <w:r>
-              <w:rPr>
-                <w:sz w:val="19"/>
-              </w:rPr>
-              <w:t>—</w:t>
-            </w:r>
-          </w:p>
-        </w:tc>
-      </w:tr>
-      <w:tr>
-        <w:tc>
-          <w:tcPr>
-            <w:tcW w:type="dxa" w:w="1520"/>
-            <w:shd w:val="clear" w:color="auto" w:fill="E8F7EE"/>
-          </w:tcPr>
-          <w:p>
-            <w:r/>
-            <w:r>
-              <w:rPr>
-                <w:sz w:val="19"/>
-              </w:rPr>
-              <w:t>1:25 – 1:50</w:t>
-            </w:r>
-          </w:p>
-        </w:tc>
-        <w:tc>
-          <w:tcPr>
-            <w:tcW w:type="dxa" w:w="1000"/>
-            <w:shd w:val="clear" w:color="auto" w:fill="E8F7EE"/>
-          </w:tcPr>
-          <w:p>
-            <w:r/>
-            <w:r>
-              <w:rPr>
-                <w:sz w:val="19"/>
-              </w:rPr>
-              <w:t>25 min</w:t>
-            </w:r>
-          </w:p>
-        </w:tc>
-        <w:tc>
-          <w:tcPr>
-            <w:tcW w:type="dxa" w:w="1728"/>
-            <w:shd w:val="clear" w:color="auto" w:fill="E8F7EE"/>
-          </w:tcPr>
-          <w:p>
-            <w:r/>
-            <w:r>
-              <w:rPr>
-                <w:b/>
-                <w:sz w:val="19"/>
-              </w:rPr>
-              <w:t>Lab 14 (cont.): threshold condition, notify, test all paths</w:t>
-            </w:r>
-          </w:p>
-        </w:tc>
-        <w:tc>
-          <w:tcPr>
-            <w:tcW w:type="dxa" w:w="1760"/>
-            <w:shd w:val="clear" w:color="auto" w:fill="E8F7EE"/>
-          </w:tcPr>
-          <w:p>
-            <w:r/>
-            <w:r>
-              <w:rPr>
-                <w:sz w:val="19"/>
-              </w:rPr>
-              <w:t>Hands-on lab</w:t>
-            </w:r>
-          </w:p>
-        </w:tc>
-        <w:tc>
-          <w:tcPr>
-            <w:tcW w:type="dxa" w:w="1120"/>
-            <w:shd w:val="clear" w:color="auto" w:fill="E8F7EE"/>
-          </w:tcPr>
-          <w:p>
-            <w:r/>
-            <w:r>
-              <w:rPr>
-                <w:sz w:val="19"/>
-              </w:rPr>
-              <w:t>84</w:t>
-            </w:r>
-          </w:p>
-        </w:tc>
-      </w:tr>
-      <w:tr>
-        <w:tc>
-          <w:tcPr>
-            <w:tcW w:type="dxa" w:w="1520"/>
-            <w:shd w:val="clear" w:color="auto" w:fill="E8F7EE"/>
-          </w:tcPr>
-          <w:p>
-            <w:r/>
-            <w:r>
-              <w:rPr>
-                <w:sz w:val="19"/>
-              </w:rPr>
-              <w:t>1:50 – 2:35</w:t>
-            </w:r>
-          </w:p>
-        </w:tc>
-        <w:tc>
-          <w:tcPr>
-            <w:tcW w:type="dxa" w:w="1000"/>
-            <w:shd w:val="clear" w:color="auto" w:fill="E8F7EE"/>
-          </w:tcPr>
-          <w:p>
-            <w:r/>
-            <w:r>
-              <w:rPr>
-                <w:sz w:val="19"/>
-              </w:rPr>
-              <w:t>45 min</w:t>
-            </w:r>
-          </w:p>
-        </w:tc>
-        <w:tc>
-          <w:tcPr>
-            <w:tcW w:type="dxa" w:w="1728"/>
-            <w:shd w:val="clear" w:color="auto" w:fill="E8F7EE"/>
-          </w:tcPr>
-          <w:p>
-            <w:r/>
-            <w:r>
-              <w:rPr>
-                <w:b/>
-                <w:sz w:val="19"/>
-              </w:rPr>
-              <w:t>Lab 15: Order Processing (Agent + Flow) — confirm, log, restock alert</w:t>
-            </w:r>
-          </w:p>
-        </w:tc>
-        <w:tc>
-          <w:tcPr>
-            <w:tcW w:type="dxa" w:w="1760"/>
-            <w:shd w:val="clear" w:color="auto" w:fill="E8F7EE"/>
-          </w:tcPr>
-          <w:p>
-            <w:r/>
-            <w:r>
-              <w:rPr>
-                <w:sz w:val="19"/>
-              </w:rPr>
-              <w:t>Hands-on lab</w:t>
-            </w:r>
-          </w:p>
-        </w:tc>
-        <w:tc>
-          <w:tcPr>
-            <w:tcW w:type="dxa" w:w="1120"/>
-            <w:shd w:val="clear" w:color="auto" w:fill="E8F7EE"/>
-          </w:tcPr>
-          <w:p>
-            <w:r/>
-            <w:r>
-              <w:rPr>
-                <w:sz w:val="19"/>
-              </w:rPr>
-              <w:t>85–86</w:t>
-            </w:r>
-          </w:p>
-        </w:tc>
-      </w:tr>
-      <w:tr>
-        <w:tc>
-          <w:tcPr>
-            <w:tcW w:type="dxa" w:w="1520"/>
-            <w:shd w:val="clear" w:color="auto" w:fill="FFF4E5"/>
-          </w:tcPr>
-          <w:p>
-            <w:r/>
-            <w:r>
-              <w:rPr>
-                <w:sz w:val="19"/>
-              </w:rPr>
-              <w:t>2:35 – 2:45</w:t>
-            </w:r>
-          </w:p>
-        </w:tc>
-        <w:tc>
-          <w:tcPr>
-            <w:tcW w:type="dxa" w:w="1000"/>
-            <w:shd w:val="clear" w:color="auto" w:fill="FFF4E5"/>
-          </w:tcPr>
-          <w:p>
-            <w:r/>
-            <w:r>
-              <w:rPr>
-                <w:sz w:val="19"/>
-              </w:rPr>
-              <w:t>10 min</w:t>
-            </w:r>
-          </w:p>
-        </w:tc>
-        <w:tc>
-          <w:tcPr>
-            <w:tcW w:type="dxa" w:w="1728"/>
-            <w:shd w:val="clear" w:color="auto" w:fill="FFF4E5"/>
-          </w:tcPr>
-          <w:p>
-            <w:r/>
-            <w:r>
-              <w:rPr>
-                <w:sz w:val="19"/>
-              </w:rPr>
-              <w:t>Tea break</w:t>
-            </w:r>
-          </w:p>
-        </w:tc>
-        <w:tc>
-          <w:tcPr>
-            <w:tcW w:type="dxa" w:w="1760"/>
-            <w:shd w:val="clear" w:color="auto" w:fill="FFF4E5"/>
-          </w:tcPr>
-          <w:p>
-            <w:r/>
-            <w:r>
-              <w:rPr>
-                <w:sz w:val="19"/>
-              </w:rPr>
-              <w:t>—</w:t>
-            </w:r>
-          </w:p>
-        </w:tc>
-        <w:tc>
-          <w:tcPr>
-            <w:tcW w:type="dxa" w:w="1120"/>
-            <w:shd w:val="clear" w:color="auto" w:fill="FFF4E5"/>
-          </w:tcPr>
-          <w:p>
-            <w:r/>
-            <w:r>
-              <w:rPr>
-                <w:sz w:val="19"/>
-              </w:rPr>
-              <w:t>—</w:t>
+              <w:t>71–72</w:t>
             </w:r>
           </w:p>
         </w:tc>
@@ -3964,7 +2957,7 @@
               <w:rPr>
                 <w:sz w:val="19"/>
               </w:rPr>
-              <w:t>2:45 – 3:00</w:t>
+              <w:t>3:30 – 4:00</w:t>
             </w:r>
           </w:p>
         </w:tc>
@@ -3979,7 +2972,7 @@
               <w:rPr>
                 <w:sz w:val="19"/>
               </w:rPr>
-              <w:t>15 min</w:t>
+              <w:t>30 min</w:t>
             </w:r>
           </w:p>
         </w:tc>
@@ -3995,163 +2988,7 @@
                 <w:b/>
                 <w:sz w:val="19"/>
               </w:rPr>
-              <w:t>Module 5: Business Workflow Workshop briefing</w:t>
-            </w:r>
-          </w:p>
-        </w:tc>
-        <w:tc>
-          <w:tcPr>
-            <w:tcW w:type="dxa" w:w="1760"/>
-            <w:shd w:val="clear" w:color="auto" w:fill="EAF1FF"/>
-          </w:tcPr>
-          <w:p>
-            <w:r/>
-            <w:r>
-              <w:rPr>
-                <w:sz w:val="19"/>
-              </w:rPr>
-              <w:t>Lecture &amp; demo</w:t>
-            </w:r>
-          </w:p>
-        </w:tc>
-        <w:tc>
-          <w:tcPr>
-            <w:tcW w:type="dxa" w:w="1120"/>
-            <w:shd w:val="clear" w:color="auto" w:fill="EAF1FF"/>
-          </w:tcPr>
-          <w:p>
-            <w:r/>
-            <w:r>
-              <w:rPr>
-                <w:sz w:val="19"/>
-              </w:rPr>
-              <w:t>87–93</w:t>
-            </w:r>
-          </w:p>
-        </w:tc>
-      </w:tr>
-      <w:tr>
-        <w:tc>
-          <w:tcPr>
-            <w:tcW w:type="dxa" w:w="1520"/>
-            <w:shd w:val="clear" w:color="auto" w:fill="E8F7EE"/>
-          </w:tcPr>
-          <w:p>
-            <w:r/>
-            <w:r>
-              <w:rPr>
-                <w:sz w:val="19"/>
-              </w:rPr>
-              <w:t>3:00 – 3:50</w:t>
-            </w:r>
-          </w:p>
-        </w:tc>
-        <w:tc>
-          <w:tcPr>
-            <w:tcW w:type="dxa" w:w="1000"/>
-            <w:shd w:val="clear" w:color="auto" w:fill="E8F7EE"/>
-          </w:tcPr>
-          <w:p>
-            <w:r/>
-            <w:r>
-              <w:rPr>
-                <w:sz w:val="19"/>
-              </w:rPr>
-              <w:t>50 min</w:t>
-            </w:r>
-          </w:p>
-        </w:tc>
-        <w:tc>
-          <w:tcPr>
-            <w:tcW w:type="dxa" w:w="1728"/>
-            <w:shd w:val="clear" w:color="auto" w:fill="E8F7EE"/>
-          </w:tcPr>
-          <w:p>
-            <w:r/>
-            <w:r>
-              <w:rPr>
-                <w:b/>
-                <w:sz w:val="19"/>
-              </w:rPr>
-              <w:t>Lab 16: Capstone Workshop — design, build &amp; present your own workflow</w:t>
-            </w:r>
-          </w:p>
-        </w:tc>
-        <w:tc>
-          <w:tcPr>
-            <w:tcW w:type="dxa" w:w="1760"/>
-            <w:shd w:val="clear" w:color="auto" w:fill="E8F7EE"/>
-          </w:tcPr>
-          <w:p>
-            <w:r/>
-            <w:r>
-              <w:rPr>
-                <w:sz w:val="19"/>
-              </w:rPr>
-              <w:t>Hands-on lab</w:t>
-            </w:r>
-          </w:p>
-        </w:tc>
-        <w:tc>
-          <w:tcPr>
-            <w:tcW w:type="dxa" w:w="1120"/>
-            <w:shd w:val="clear" w:color="auto" w:fill="E8F7EE"/>
-          </w:tcPr>
-          <w:p>
-            <w:r/>
-            <w:r>
-              <w:rPr>
-                <w:sz w:val="19"/>
-              </w:rPr>
-              <w:t>94–95</w:t>
-            </w:r>
-          </w:p>
-        </w:tc>
-      </w:tr>
-      <w:tr>
-        <w:tc>
-          <w:tcPr>
-            <w:tcW w:type="dxa" w:w="1520"/>
-            <w:shd w:val="clear" w:color="auto" w:fill="EAF1FF"/>
-          </w:tcPr>
-          <w:p>
-            <w:r/>
-            <w:r>
-              <w:rPr>
-                <w:sz w:val="19"/>
-              </w:rPr>
-              <w:t>3:50 – 4:00</w:t>
-            </w:r>
-          </w:p>
-        </w:tc>
-        <w:tc>
-          <w:tcPr>
-            <w:tcW w:type="dxa" w:w="1000"/>
-            <w:shd w:val="clear" w:color="auto" w:fill="EAF1FF"/>
-          </w:tcPr>
-          <w:p>
-            <w:r/>
-            <w:r>
-              <w:rPr>
-                <w:sz w:val="19"/>
-              </w:rPr>
-              <w:t>10 min</w:t>
-            </w:r>
-          </w:p>
-        </w:tc>
-        <w:tc>
-          <w:tcPr>
-            <w:tcW w:type="dxa" w:w="1728"/>
-            <w:shd w:val="clear" w:color="auto" w:fill="EAF1FF"/>
-          </w:tcPr>
-          <w:p>
-            <w:r/>
-            <w:r>
-              <w:rPr>
-                <w:b/>
-                <w:sz w:val="19"/>
-              </w:rPr>
-              <w:t>Course wrap-up, LMS courseware download, briefing for assessment</w:t>
+              <w:t>Testing &amp; debugging agents, Day 2 recap, course wrap-up &amp; briefing for assessment</w:t>
             </w:r>
           </w:p>
         </w:tc>
@@ -4181,7 +3018,7 @@
               <w:rPr>
                 <w:sz w:val="19"/>
               </w:rPr>
-              <w:t>96–107</w:t>
+              <w:t>72–85</w:t>
             </w:r>
           </w:p>
         </w:tc>
@@ -4574,7 +3411,7 @@
     </w:p>
     <w:p>
       <w:r>
-        <w:t>The summative WSQ assessment is taken on Day 3, 4:00 – 6:00pm, and is open book (slides, Learner Guide and approved materials only):</w:t>
+        <w:t>The summative WSQ assessment is taken on Day 2, 4:00 – 6:00pm, and is open book (slides, Learner Guide and approved materials only):</w:t>
       </w:r>
     </w:p>
     <w:p>
@@ -4582,7 +3419,7 @@
         <w:pStyle w:val="ListBullet"/>
       </w:pPr>
       <w:r>
-        <w:t>Written Assessment (WA / SAQ) — 1 hour, 4:00 – 5:00pm. Open-ended short-answer questions testing the knowledge from Modules 1–4.</w:t>
+        <w:t>Written Assessment (WA / SAQ) — 1 hour, 4:00 – 5:00pm. Open-ended short-answer questions testing the knowledge from Modules 1–3.</w:t>
       </w:r>
     </w:p>
     <w:p>
@@ -4619,7 +3456,7 @@
     </w:p>
     <w:p>
       <w:r>
-        <w:t>Formative assessment is continuous: each lab includes a Checkpoint that the facilitator verifies, and the Day-3 capstone (Lab 16) is presented against the published quality bar (clear trigger, data logged, at least one condition, an approval or AI-generated response, notifications for every outcome, and a tested happy path + branches).</w:t>
+        <w:t>Formative assessment is continuous: each lab includes a Checkpoint that the facilitator verifies before the class moves on, and Lab 10 (Procurement Request Workflow) serves as the integrative check that a participant can wire an agent to a flow end-to-end ahead of the Practical Performance assessment.</w:t>
       </w:r>
     </w:p>
     <w:sectPr>

</xml_diff>

<commit_message>
feat: publish realistic automation and agent labs
</commit_message>
<xml_diff>
--- a/courseware/LP-Business Process Automation with Power Automate and Copilot Studio Agents.docx
+++ b/courseware/LP-Business Process Automation with Power Automate and Copilot Studio Agents.docx
@@ -167,7 +167,7 @@
           <w:color w:val="1F6FEB"/>
           <w:sz w:val="24"/>
         </w:rPr>
-        <w:t>Version 3.0</w:t>
+        <w:t>Version 3.3</w:t>
       </w:r>
     </w:p>
     <w:p>
@@ -427,6 +427,238 @@
                 <w:sz w:val="19"/>
               </w:rPr>
               <w:t>Course restructured from 3 days to 2 days — Day 1: Power Automate, Day 2: Copilot Studio agents ending with the assessment block (WA 1 hr + PP 1 hr, 4:00-6:00pm). Modules 4-5 and Labs 12-16 retired; slide mapping updated for the 86-slide v3 deck.</w:t>
+            </w:r>
+          </w:p>
+        </w:tc>
+        <w:tc>
+          <w:tcPr>
+            <w:tcW w:type="dxa" w:w="2160"/>
+          </w:tcPr>
+          <w:p>
+            <w:r/>
+            <w:r>
+              <w:rPr>
+                <w:sz w:val="19"/>
+              </w:rPr>
+              <w:t>Course Development Team</w:t>
+            </w:r>
+          </w:p>
+        </w:tc>
+      </w:tr>
+      <w:tr>
+        <w:tc>
+          <w:tcPr>
+            <w:tcW w:type="dxa" w:w="2160"/>
+          </w:tcPr>
+          <w:p>
+            <w:r/>
+            <w:r>
+              <w:rPr>
+                <w:sz w:val="19"/>
+              </w:rPr>
+              <w:t>3.1</w:t>
+            </w:r>
+          </w:p>
+        </w:tc>
+        <w:tc>
+          <w:tcPr>
+            <w:tcW w:type="dxa" w:w="2160"/>
+          </w:tcPr>
+          <w:p>
+            <w:r/>
+            <w:r>
+              <w:rPr>
+                <w:sz w:val="19"/>
+              </w:rPr>
+              <w:t>24 Jul 2026</w:t>
+            </w:r>
+          </w:p>
+        </w:tc>
+        <w:tc>
+          <w:tcPr>
+            <w:tcW w:type="dxa" w:w="2160"/>
+          </w:tcPr>
+          <w:p>
+            <w:r/>
+            <w:r>
+              <w:rPr>
+                <w:sz w:val="19"/>
+              </w:rPr>
+              <w:t>Labs 8-10 updated to paired Microsoft Teams and website experiences covering an ordinary HTTP flow, deterministic agent flow, and guarded AI prompt flow.</w:t>
+            </w:r>
+          </w:p>
+        </w:tc>
+        <w:tc>
+          <w:tcPr>
+            <w:tcW w:type="dxa" w:w="2160"/>
+          </w:tcPr>
+          <w:p>
+            <w:r/>
+            <w:r>
+              <w:rPr>
+                <w:sz w:val="19"/>
+              </w:rPr>
+              <w:t>Course Development Team</w:t>
+            </w:r>
+          </w:p>
+        </w:tc>
+      </w:tr>
+      <w:tr>
+        <w:tc>
+          <w:tcPr>
+            <w:tcW w:type="dxa" w:w="2160"/>
+          </w:tcPr>
+          <w:p>
+            <w:r/>
+            <w:r>
+              <w:rPr>
+                <w:sz w:val="19"/>
+              </w:rPr>
+              <w:t>3.2</w:t>
+            </w:r>
+          </w:p>
+        </w:tc>
+        <w:tc>
+          <w:tcPr>
+            <w:tcW w:type="dxa" w:w="2160"/>
+          </w:tcPr>
+          <w:p>
+            <w:r/>
+            <w:r>
+              <w:rPr>
+                <w:sz w:val="19"/>
+              </w:rPr>
+              <w:t>24 Jul 2026</w:t>
+            </w:r>
+          </w:p>
+        </w:tc>
+        <w:tc>
+          <w:tcPr>
+            <w:tcW w:type="dxa" w:w="2160"/>
+          </w:tcPr>
+          <w:p>
+            <w:r/>
+            <w:r>
+              <w:rPr>
+                <w:sz w:val="19"/>
+              </w:rPr>
+              <w:t>Day 2 now concludes at Lab 10; the former Lab 11 slot is integrated testing, troubleshooting, comparison and assessment preparation.</w:t>
+            </w:r>
+          </w:p>
+        </w:tc>
+        <w:tc>
+          <w:tcPr>
+            <w:tcW w:type="dxa" w:w="2160"/>
+          </w:tcPr>
+          <w:p>
+            <w:r/>
+            <w:r>
+              <w:rPr>
+                <w:sz w:val="19"/>
+              </w:rPr>
+              <w:t>Course Development Team</w:t>
+            </w:r>
+          </w:p>
+        </w:tc>
+      </w:tr>
+      <w:tr>
+        <w:tc>
+          <w:tcPr>
+            <w:tcW w:type="dxa" w:w="2160"/>
+          </w:tcPr>
+          <w:p>
+            <w:r/>
+            <w:r>
+              <w:rPr>
+                <w:sz w:val="19"/>
+              </w:rPr>
+              <w:t>3.3</w:t>
+            </w:r>
+          </w:p>
+        </w:tc>
+        <w:tc>
+          <w:tcPr>
+            <w:tcW w:type="dxa" w:w="2160"/>
+          </w:tcPr>
+          <w:p>
+            <w:r/>
+            <w:r>
+              <w:rPr>
+                <w:sz w:val="19"/>
+              </w:rPr>
+              <w:t>24 Jul 2026</w:t>
+            </w:r>
+          </w:p>
+        </w:tc>
+        <w:tc>
+          <w:tcPr>
+            <w:tcW w:type="dxa" w:w="2160"/>
+          </w:tcPr>
+          <w:p>
+            <w:r/>
+            <w:r>
+              <w:rPr>
+                <w:sz w:val="19"/>
+              </w:rPr>
+              <w:t>Reorganised Day 2 into two connected projects: prompt-created IT Support agent upgraded with RAG, followed by one Marina Trust agent progressively upgraded with HTTP, deterministic agent-flow and AI prompt-flow capabilities.</w:t>
+            </w:r>
+          </w:p>
+        </w:tc>
+        <w:tc>
+          <w:tcPr>
+            <w:tcW w:type="dxa" w:w="2160"/>
+          </w:tcPr>
+          <w:p>
+            <w:r/>
+            <w:r>
+              <w:rPr>
+                <w:sz w:val="19"/>
+              </w:rPr>
+              <w:t>Course Development Team</w:t>
+            </w:r>
+          </w:p>
+        </w:tc>
+      </w:tr>
+      <w:tr>
+        <w:tc>
+          <w:tcPr>
+            <w:tcW w:type="dxa" w:w="2160"/>
+          </w:tcPr>
+          <w:p>
+            <w:r/>
+            <w:r>
+              <w:rPr>
+                <w:sz w:val="19"/>
+              </w:rPr>
+              <w:t>3.4</w:t>
+            </w:r>
+          </w:p>
+        </w:tc>
+        <w:tc>
+          <w:tcPr>
+            <w:tcW w:type="dxa" w:w="2160"/>
+          </w:tcPr>
+          <w:p>
+            <w:r/>
+            <w:r>
+              <w:rPr>
+                <w:sz w:val="19"/>
+              </w:rPr>
+              <w:t>24 Jul 2026</w:t>
+            </w:r>
+          </w:p>
+        </w:tc>
+        <w:tc>
+          <w:tcPr>
+            <w:tcW w:type="dxa" w:w="2160"/>
+          </w:tcPr>
+          <w:p>
+            <w:r/>
+            <w:r>
+              <w:rPr>
+                <w:sz w:val="19"/>
+              </w:rPr>
+              <w:t>Reordered the practical journey from instant and scheduled flows through automated, approval and HTTP flows, then agent creation, RAG, Teams/website deployment, agent flow and prompt flow.</w:t>
             </w:r>
           </w:p>
         </w:tc>
@@ -729,7 +961,7 @@
               <w:rPr>
                 <w:sz w:val="20"/>
               </w:rPr>
-              <w:t>12 step-by-step labs across 2 days (Labs 0–11), plus 3 concept modules</w:t>
+              <w:t>13 step-by-step labs across 2 days (8 on Day 1 and 5 on Day 2), plus 3 concept modules</w:t>
             </w:r>
           </w:p>
         </w:tc>
@@ -869,6 +1101,9 @@
         <w:gridCol w:w="1728"/>
       </w:tblGrid>
       <w:tr>
+        <w:trPr>
+          <w:cantSplit/>
+        </w:trPr>
         <w:tc>
           <w:tcPr>
             <w:tcW w:type="dxa" w:w="1520"/>
@@ -956,6 +1191,9 @@
         </w:tc>
       </w:tr>
       <w:tr>
+        <w:trPr>
+          <w:cantSplit/>
+        </w:trPr>
         <w:tc>
           <w:tcPr>
             <w:tcW w:type="dxa" w:w="1520"/>
@@ -1034,6 +1272,9 @@
         </w:tc>
       </w:tr>
       <w:tr>
+        <w:trPr>
+          <w:cantSplit/>
+        </w:trPr>
         <w:tc>
           <w:tcPr>
             <w:tcW w:type="dxa" w:w="1520"/>
@@ -1112,6 +1353,9 @@
         </w:tc>
       </w:tr>
       <w:tr>
+        <w:trPr>
+          <w:cantSplit/>
+        </w:trPr>
         <w:tc>
           <w:tcPr>
             <w:tcW w:type="dxa" w:w="1520"/>
@@ -1190,6 +1434,9 @@
         </w:tc>
       </w:tr>
       <w:tr>
+        <w:trPr>
+          <w:cantSplit/>
+        </w:trPr>
         <w:tc>
           <w:tcPr>
             <w:tcW w:type="dxa" w:w="1520"/>
@@ -1267,6 +1514,9 @@
         </w:tc>
       </w:tr>
       <w:tr>
+        <w:trPr>
+          <w:cantSplit/>
+        </w:trPr>
         <w:tc>
           <w:tcPr>
             <w:tcW w:type="dxa" w:w="1520"/>
@@ -1345,6 +1595,9 @@
         </w:tc>
       </w:tr>
       <w:tr>
+        <w:trPr>
+          <w:cantSplit/>
+        </w:trPr>
         <w:tc>
           <w:tcPr>
             <w:tcW w:type="dxa" w:w="1520"/>
@@ -1356,7 +1609,7 @@
               <w:rPr>
                 <w:sz w:val="19"/>
               </w:rPr>
-              <w:t>11:30 – 12:30</w:t>
+              <w:t>11:30 – 12:15</w:t>
             </w:r>
           </w:p>
         </w:tc>
@@ -1371,7 +1624,7 @@
               <w:rPr>
                 <w:sz w:val="19"/>
               </w:rPr>
-              <w:t>60 min</w:t>
+              <w:t>45 min</w:t>
             </w:r>
           </w:p>
         </w:tc>
@@ -1387,7 +1640,7 @@
                 <w:b/>
                 <w:sz w:val="19"/>
               </w:rPr>
-              <w:t>Lab 1: Automated Email Workflow (manual trigger + input → Send an email)</w:t>
+              <w:t>Lab 1: Instant Email Flow — prompt, manual trigger and dynamic input</w:t>
             </w:r>
           </w:p>
         </w:tc>
@@ -1423,6 +1676,90 @@
         </w:tc>
       </w:tr>
       <w:tr>
+        <w:trPr>
+          <w:cantSplit/>
+        </w:trPr>
+        <w:tc>
+          <w:tcPr>
+            <w:tcW w:type="dxa" w:w="1520"/>
+            <w:shd w:val="clear" w:color="auto" w:fill="E8F7EE"/>
+          </w:tcPr>
+          <w:p>
+            <w:r/>
+            <w:r>
+              <w:rPr>
+                <w:sz w:val="19"/>
+              </w:rPr>
+              <w:t>12:15 – 12:45</w:t>
+            </w:r>
+          </w:p>
+        </w:tc>
+        <w:tc>
+          <w:tcPr>
+            <w:tcW w:type="dxa" w:w="1000"/>
+            <w:shd w:val="clear" w:color="auto" w:fill="E8F7EE"/>
+          </w:tcPr>
+          <w:p>
+            <w:r/>
+            <w:r>
+              <w:rPr>
+                <w:sz w:val="19"/>
+              </w:rPr>
+              <w:t>30 min</w:t>
+            </w:r>
+          </w:p>
+        </w:tc>
+        <w:tc>
+          <w:tcPr>
+            <w:tcW w:type="dxa" w:w="1728"/>
+            <w:shd w:val="clear" w:color="auto" w:fill="E8F7EE"/>
+          </w:tcPr>
+          <w:p>
+            <w:r/>
+            <w:r>
+              <w:rPr>
+                <w:b/>
+                <w:sz w:val="19"/>
+              </w:rPr>
+              <w:t>Lab 2: Instant Excel Flow — inputs, table mapping and fx date</w:t>
+            </w:r>
+          </w:p>
+        </w:tc>
+        <w:tc>
+          <w:tcPr>
+            <w:tcW w:type="dxa" w:w="1760"/>
+            <w:shd w:val="clear" w:color="auto" w:fill="E8F7EE"/>
+          </w:tcPr>
+          <w:p>
+            <w:r/>
+            <w:r>
+              <w:rPr>
+                <w:sz w:val="19"/>
+              </w:rPr>
+              <w:t>Hands-on lab</w:t>
+            </w:r>
+          </w:p>
+        </w:tc>
+        <w:tc>
+          <w:tcPr>
+            <w:tcW w:type="dxa" w:w="1120"/>
+            <w:shd w:val="clear" w:color="auto" w:fill="E8F7EE"/>
+          </w:tcPr>
+          <w:p>
+            <w:r/>
+            <w:r>
+              <w:rPr>
+                <w:sz w:val="19"/>
+              </w:rPr>
+              <w:t>43</w:t>
+            </w:r>
+          </w:p>
+        </w:tc>
+      </w:tr>
+      <w:tr>
+        <w:trPr>
+          <w:cantSplit/>
+        </w:trPr>
         <w:tc>
           <w:tcPr>
             <w:tcW w:type="dxa" w:w="1520"/>
@@ -1434,7 +1771,7 @@
               <w:rPr>
                 <w:sz w:val="19"/>
               </w:rPr>
-              <w:t>12:30 – 1:30</w:t>
+              <w:t>12:45 – 1:45</w:t>
             </w:r>
           </w:p>
         </w:tc>
@@ -1500,6 +1837,9 @@
         </w:tc>
       </w:tr>
       <w:tr>
+        <w:trPr>
+          <w:cantSplit/>
+        </w:trPr>
         <w:tc>
           <w:tcPr>
             <w:tcW w:type="dxa" w:w="1520"/>
@@ -1511,7 +1851,7 @@
               <w:rPr>
                 <w:sz w:val="19"/>
               </w:rPr>
-              <w:t>1:30 – 2:30</w:t>
+              <w:t>1:45 – 2:20</w:t>
             </w:r>
           </w:p>
         </w:tc>
@@ -1526,7 +1866,7 @@
               <w:rPr>
                 <w:sz w:val="19"/>
               </w:rPr>
-              <w:t>60 min</w:t>
+              <w:t>35 min</w:t>
             </w:r>
           </w:p>
         </w:tc>
@@ -1542,7 +1882,7 @@
                 <w:b/>
                 <w:sz w:val="19"/>
               </w:rPr>
-              <w:t>Lab 2: Excel Data Logging Workflow — build the table &amp; flow</w:t>
+              <w:t>Lab 3: Scheduled Flow — Recurrence, time zone and reminder</w:t>
             </w:r>
           </w:p>
         </w:tc>
@@ -1572,12 +1912,15 @@
               <w:rPr>
                 <w:sz w:val="19"/>
               </w:rPr>
-              <w:t>43</w:t>
+              <w:t>44</w:t>
             </w:r>
           </w:p>
         </w:tc>
       </w:tr>
       <w:tr>
+        <w:trPr>
+          <w:cantSplit/>
+        </w:trPr>
         <w:tc>
           <w:tcPr>
             <w:tcW w:type="dxa" w:w="1520"/>
@@ -1589,7 +1932,7 @@
               <w:rPr>
                 <w:sz w:val="19"/>
               </w:rPr>
-              <w:t>2:30 – 3:00</w:t>
+              <w:t>2:20 – 3:10</w:t>
             </w:r>
           </w:p>
         </w:tc>
@@ -1604,7 +1947,7 @@
               <w:rPr>
                 <w:sz w:val="19"/>
               </w:rPr>
-              <w:t>30 min</w:t>
+              <w:t>50 min</w:t>
             </w:r>
           </w:p>
         </w:tc>
@@ -1620,7 +1963,7 @@
                 <w:b/>
                 <w:sz w:val="19"/>
               </w:rPr>
-              <w:t>Lab 2 (cont.): map columns, fx date expression, test &amp; verify rows</w:t>
+              <w:t>Lab 4: Automated Form Flow — Forms event, email and Excel</w:t>
             </w:r>
           </w:p>
         </w:tc>
@@ -1650,12 +1993,15 @@
               <w:rPr>
                 <w:sz w:val="19"/>
               </w:rPr>
-              <w:t>43</w:t>
+              <w:t>45</w:t>
             </w:r>
           </w:p>
         </w:tc>
       </w:tr>
       <w:tr>
+        <w:trPr>
+          <w:cantSplit/>
+        </w:trPr>
         <w:tc>
           <w:tcPr>
             <w:tcW w:type="dxa" w:w="1520"/>
@@ -1667,7 +2013,7 @@
               <w:rPr>
                 <w:sz w:val="19"/>
               </w:rPr>
-              <w:t>3:00 – 3:15</w:t>
+              <w:t>3:10 – 3:25</w:t>
             </w:r>
           </w:p>
         </w:tc>
@@ -1733,6 +2079,9 @@
         </w:tc>
       </w:tr>
       <w:tr>
+        <w:trPr>
+          <w:cantSplit/>
+        </w:trPr>
         <w:tc>
           <w:tcPr>
             <w:tcW w:type="dxa" w:w="1520"/>
@@ -1744,163 +2093,7 @@
               <w:rPr>
                 <w:sz w:val="19"/>
               </w:rPr>
-              <w:t>3:15 – 4:15</w:t>
-            </w:r>
-          </w:p>
-        </w:tc>
-        <w:tc>
-          <w:tcPr>
-            <w:tcW w:type="dxa" w:w="1000"/>
-            <w:shd w:val="clear" w:color="auto" w:fill="E8F7EE"/>
-          </w:tcPr>
-          <w:p>
-            <w:r/>
-            <w:r>
-              <w:rPr>
-                <w:sz w:val="19"/>
-              </w:rPr>
-              <w:t>60 min</w:t>
-            </w:r>
-          </w:p>
-        </w:tc>
-        <w:tc>
-          <w:tcPr>
-            <w:tcW w:type="dxa" w:w="1728"/>
-            <w:shd w:val="clear" w:color="auto" w:fill="E8F7EE"/>
-          </w:tcPr>
-          <w:p>
-            <w:r/>
-            <w:r>
-              <w:rPr>
-                <w:b/>
-                <w:sz w:val="19"/>
-              </w:rPr>
-              <w:t>Lab 3: Simple Approval Workflow — approvals &amp; conditions</w:t>
-            </w:r>
-          </w:p>
-        </w:tc>
-        <w:tc>
-          <w:tcPr>
-            <w:tcW w:type="dxa" w:w="1760"/>
-            <w:shd w:val="clear" w:color="auto" w:fill="E8F7EE"/>
-          </w:tcPr>
-          <w:p>
-            <w:r/>
-            <w:r>
-              <w:rPr>
-                <w:sz w:val="19"/>
-              </w:rPr>
-              <w:t>Hands-on lab</w:t>
-            </w:r>
-          </w:p>
-        </w:tc>
-        <w:tc>
-          <w:tcPr>
-            <w:tcW w:type="dxa" w:w="1120"/>
-            <w:shd w:val="clear" w:color="auto" w:fill="E8F7EE"/>
-          </w:tcPr>
-          <w:p>
-            <w:r/>
-            <w:r>
-              <w:rPr>
-                <w:sz w:val="19"/>
-              </w:rPr>
-              <w:t>44</w:t>
-            </w:r>
-          </w:p>
-        </w:tc>
-      </w:tr>
-      <w:tr>
-        <w:tc>
-          <w:tcPr>
-            <w:tcW w:type="dxa" w:w="1520"/>
-            <w:shd w:val="clear" w:color="auto" w:fill="E8F7EE"/>
-          </w:tcPr>
-          <w:p>
-            <w:r/>
-            <w:r>
-              <w:rPr>
-                <w:sz w:val="19"/>
-              </w:rPr>
-              <w:t>4:15 – 5:15</w:t>
-            </w:r>
-          </w:p>
-        </w:tc>
-        <w:tc>
-          <w:tcPr>
-            <w:tcW w:type="dxa" w:w="1000"/>
-            <w:shd w:val="clear" w:color="auto" w:fill="E8F7EE"/>
-          </w:tcPr>
-          <w:p>
-            <w:r/>
-            <w:r>
-              <w:rPr>
-                <w:sz w:val="19"/>
-              </w:rPr>
-              <w:t>60 min</w:t>
-            </w:r>
-          </w:p>
-        </w:tc>
-        <w:tc>
-          <w:tcPr>
-            <w:tcW w:type="dxa" w:w="1728"/>
-            <w:shd w:val="clear" w:color="auto" w:fill="E8F7EE"/>
-          </w:tcPr>
-          <w:p>
-            <w:r/>
-            <w:r>
-              <w:rPr>
-                <w:b/>
-                <w:sz w:val="19"/>
-              </w:rPr>
-              <w:t>Lab 4: Scheduled Trigger Workflow — Recurrence &amp; reminders</w:t>
-            </w:r>
-          </w:p>
-        </w:tc>
-        <w:tc>
-          <w:tcPr>
-            <w:tcW w:type="dxa" w:w="1760"/>
-            <w:shd w:val="clear" w:color="auto" w:fill="E8F7EE"/>
-          </w:tcPr>
-          <w:p>
-            <w:r/>
-            <w:r>
-              <w:rPr>
-                <w:sz w:val="19"/>
-              </w:rPr>
-              <w:t>Hands-on lab</w:t>
-            </w:r>
-          </w:p>
-        </w:tc>
-        <w:tc>
-          <w:tcPr>
-            <w:tcW w:type="dxa" w:w="1120"/>
-            <w:shd w:val="clear" w:color="auto" w:fill="E8F7EE"/>
-          </w:tcPr>
-          <w:p>
-            <w:r/>
-            <w:r>
-              <w:rPr>
-                <w:sz w:val="19"/>
-              </w:rPr>
-              <w:t>45</w:t>
-            </w:r>
-          </w:p>
-        </w:tc>
-      </w:tr>
-      <w:tr>
-        <w:tc>
-          <w:tcPr>
-            <w:tcW w:type="dxa" w:w="1520"/>
-            <w:shd w:val="clear" w:color="auto" w:fill="E8F7EE"/>
-          </w:tcPr>
-          <w:p>
-            <w:r/>
-            <w:r>
-              <w:rPr>
-                <w:sz w:val="19"/>
-              </w:rPr>
-              <w:t>5:15 – 6:00</w:t>
+              <w:t>3:25 – 4:10</w:t>
             </w:r>
           </w:p>
         </w:tc>
@@ -1931,7 +2124,7 @@
                 <w:b/>
                 <w:sz w:val="19"/>
               </w:rPr>
-              <w:t>Lab 5: Form Submission Workflow + Day 1 recap &amp; Q&amp;A</w:t>
+              <w:t>Lab 5: Human Approval Flow — pause, decision and branching</w:t>
             </w:r>
           </w:p>
         </w:tc>
@@ -1961,7 +2154,250 @@
               <w:rPr>
                 <w:sz w:val="19"/>
               </w:rPr>
-              <w:t>46–47</w:t>
+              <w:t>46</w:t>
+            </w:r>
+          </w:p>
+        </w:tc>
+      </w:tr>
+      <w:tr>
+        <w:trPr>
+          <w:cantSplit/>
+        </w:trPr>
+        <w:tc>
+          <w:tcPr>
+            <w:tcW w:type="dxa" w:w="1520"/>
+            <w:shd w:val="clear" w:color="auto" w:fill="E8F7EE"/>
+          </w:tcPr>
+          <w:p>
+            <w:r/>
+            <w:r>
+              <w:rPr>
+                <w:sz w:val="19"/>
+              </w:rPr>
+              <w:t>4:10 – 5:00</w:t>
+            </w:r>
+          </w:p>
+        </w:tc>
+        <w:tc>
+          <w:tcPr>
+            <w:tcW w:type="dxa" w:w="1000"/>
+            <w:shd w:val="clear" w:color="auto" w:fill="E8F7EE"/>
+          </w:tcPr>
+          <w:p>
+            <w:r/>
+            <w:r>
+              <w:rPr>
+                <w:sz w:val="19"/>
+              </w:rPr>
+              <w:t>50 min</w:t>
+            </w:r>
+          </w:p>
+        </w:tc>
+        <w:tc>
+          <w:tcPr>
+            <w:tcW w:type="dxa" w:w="1728"/>
+            <w:shd w:val="clear" w:color="auto" w:fill="E8F7EE"/>
+          </w:tcPr>
+          <w:p>
+            <w:r/>
+            <w:r>
+              <w:rPr>
+                <w:b/>
+                <w:sz w:val="19"/>
+              </w:rPr>
+              <w:t>Lab 6A: HTTP Enquiry Webhook — website POST and JSON response</w:t>
+            </w:r>
+          </w:p>
+        </w:tc>
+        <w:tc>
+          <w:tcPr>
+            <w:tcW w:type="dxa" w:w="1760"/>
+            <w:shd w:val="clear" w:color="auto" w:fill="E8F7EE"/>
+          </w:tcPr>
+          <w:p>
+            <w:r/>
+            <w:r>
+              <w:rPr>
+                <w:sz w:val="19"/>
+              </w:rPr>
+              <w:t>Hands-on lab</w:t>
+            </w:r>
+          </w:p>
+        </w:tc>
+        <w:tc>
+          <w:tcPr>
+            <w:tcW w:type="dxa" w:w="1120"/>
+            <w:shd w:val="clear" w:color="auto" w:fill="E8F7EE"/>
+          </w:tcPr>
+          <w:p>
+            <w:r/>
+            <w:r>
+              <w:rPr>
+                <w:sz w:val="19"/>
+              </w:rPr>
+              <w:t>46</w:t>
+            </w:r>
+          </w:p>
+        </w:tc>
+      </w:tr>
+      <w:tr>
+        <w:trPr>
+          <w:cantSplit/>
+        </w:trPr>
+        <w:tc>
+          <w:tcPr>
+            <w:tcW w:type="dxa" w:w="1520"/>
+            <w:shd w:val="clear" w:color="auto" w:fill="E8F7EE"/>
+          </w:tcPr>
+          <w:p>
+            <w:r/>
+            <w:r>
+              <w:rPr>
+                <w:sz w:val="19"/>
+              </w:rPr>
+              <w:t>5:00 – 5:45</w:t>
+            </w:r>
+          </w:p>
+        </w:tc>
+        <w:tc>
+          <w:tcPr>
+            <w:tcW w:type="dxa" w:w="1000"/>
+            <w:shd w:val="clear" w:color="auto" w:fill="E8F7EE"/>
+          </w:tcPr>
+          <w:p>
+            <w:r/>
+            <w:r>
+              <w:rPr>
+                <w:sz w:val="19"/>
+              </w:rPr>
+              <w:t>45 min</w:t>
+            </w:r>
+          </w:p>
+        </w:tc>
+        <w:tc>
+          <w:tcPr>
+            <w:tcW w:type="dxa" w:w="1728"/>
+            <w:shd w:val="clear" w:color="auto" w:fill="E8F7EE"/>
+          </w:tcPr>
+          <w:p>
+            <w:r/>
+            <w:r>
+              <w:rPr>
+                <w:b/>
+                <w:sz w:val="19"/>
+              </w:rPr>
+              <w:t>Lab 6B: Deterministic Webhook Chatbot — route and return a reply</w:t>
+            </w:r>
+          </w:p>
+        </w:tc>
+        <w:tc>
+          <w:tcPr>
+            <w:tcW w:type="dxa" w:w="1760"/>
+            <w:shd w:val="clear" w:color="auto" w:fill="E8F7EE"/>
+          </w:tcPr>
+          <w:p>
+            <w:r/>
+            <w:r>
+              <w:rPr>
+                <w:sz w:val="19"/>
+              </w:rPr>
+              <w:t>Hands-on lab</w:t>
+            </w:r>
+          </w:p>
+        </w:tc>
+        <w:tc>
+          <w:tcPr>
+            <w:tcW w:type="dxa" w:w="1120"/>
+            <w:shd w:val="clear" w:color="auto" w:fill="E8F7EE"/>
+          </w:tcPr>
+          <w:p>
+            <w:r/>
+            <w:r>
+              <w:rPr>
+                <w:sz w:val="19"/>
+              </w:rPr>
+              <w:t>46</w:t>
+            </w:r>
+          </w:p>
+        </w:tc>
+      </w:tr>
+      <w:tr>
+        <w:trPr>
+          <w:cantSplit/>
+        </w:trPr>
+        <w:tc>
+          <w:tcPr>
+            <w:tcW w:type="dxa" w:w="1520"/>
+            <w:shd w:val="clear" w:color="auto" w:fill="EAF1FF"/>
+          </w:tcPr>
+          <w:p>
+            <w:r/>
+            <w:r>
+              <w:rPr>
+                <w:sz w:val="19"/>
+              </w:rPr>
+              <w:t>5:45 – 6:00</w:t>
+            </w:r>
+          </w:p>
+        </w:tc>
+        <w:tc>
+          <w:tcPr>
+            <w:tcW w:type="dxa" w:w="1000"/>
+            <w:shd w:val="clear" w:color="auto" w:fill="EAF1FF"/>
+          </w:tcPr>
+          <w:p>
+            <w:r/>
+            <w:r>
+              <w:rPr>
+                <w:sz w:val="19"/>
+              </w:rPr>
+              <w:t>15 min</w:t>
+            </w:r>
+          </w:p>
+        </w:tc>
+        <w:tc>
+          <w:tcPr>
+            <w:tcW w:type="dxa" w:w="1728"/>
+            <w:shd w:val="clear" w:color="auto" w:fill="EAF1FF"/>
+          </w:tcPr>
+          <w:p>
+            <w:r/>
+            <w:r>
+              <w:rPr>
+                <w:b/>
+                <w:sz w:val="19"/>
+              </w:rPr>
+              <w:t>Day 1 recap: compare instant, scheduled, automated, approval and HTTP triggers</w:t>
+            </w:r>
+          </w:p>
+        </w:tc>
+        <w:tc>
+          <w:tcPr>
+            <w:tcW w:type="dxa" w:w="1760"/>
+            <w:shd w:val="clear" w:color="auto" w:fill="EAF1FF"/>
+          </w:tcPr>
+          <w:p>
+            <w:r/>
+            <w:r>
+              <w:rPr>
+                <w:sz w:val="19"/>
+              </w:rPr>
+              <w:t>Facilitated discussion</w:t>
+            </w:r>
+          </w:p>
+        </w:tc>
+        <w:tc>
+          <w:tcPr>
+            <w:tcW w:type="dxa" w:w="1120"/>
+            <w:shd w:val="clear" w:color="auto" w:fill="EAF1FF"/>
+          </w:tcPr>
+          <w:p>
+            <w:r/>
+            <w:r>
+              <w:rPr>
+                <w:sz w:val="19"/>
+              </w:rPr>
+              <w:t>47</w:t>
             </w:r>
           </w:p>
         </w:tc>
@@ -2004,6 +2440,9 @@
         <w:gridCol w:w="1728"/>
       </w:tblGrid>
       <w:tr>
+        <w:trPr>
+          <w:cantSplit/>
+        </w:trPr>
         <w:tc>
           <w:tcPr>
             <w:tcW w:type="dxa" w:w="1520"/>
@@ -2091,6 +2530,9 @@
         </w:tc>
       </w:tr>
       <w:tr>
+        <w:trPr>
+          <w:cantSplit/>
+        </w:trPr>
         <w:tc>
           <w:tcPr>
             <w:tcW w:type="dxa" w:w="1520"/>
@@ -2169,6 +2611,9 @@
         </w:tc>
       </w:tr>
       <w:tr>
+        <w:trPr>
+          <w:cantSplit/>
+        </w:trPr>
         <w:tc>
           <w:tcPr>
             <w:tcW w:type="dxa" w:w="1520"/>
@@ -2247,6 +2692,9 @@
         </w:tc>
       </w:tr>
       <w:tr>
+        <w:trPr>
+          <w:cantSplit/>
+        </w:trPr>
         <w:tc>
           <w:tcPr>
             <w:tcW w:type="dxa" w:w="1520"/>
@@ -2289,7 +2737,7 @@
                 <w:b/>
                 <w:sz w:val="19"/>
               </w:rPr>
-              <w:t>Lab 6: Create Your First Agent — instructions, knowledge, Test pane</w:t>
+              <w:t>Lab 7A: Create the IT Support agent — instructions, boundaries and Preview/Test</w:t>
             </w:r>
           </w:p>
         </w:tc>
@@ -2325,6 +2773,9 @@
         </w:tc>
       </w:tr>
       <w:tr>
+        <w:trPr>
+          <w:cantSplit/>
+        </w:trPr>
         <w:tc>
           <w:tcPr>
             <w:tcW w:type="dxa" w:w="1520"/>
@@ -2402,6 +2853,9 @@
         </w:tc>
       </w:tr>
       <w:tr>
+        <w:trPr>
+          <w:cantSplit/>
+        </w:trPr>
         <w:tc>
           <w:tcPr>
             <w:tcW w:type="dxa" w:w="1520"/>
@@ -2444,7 +2898,7 @@
                 <w:b/>
                 <w:sz w:val="19"/>
               </w:rPr>
-              <w:t>Lab 7: Add Knowledge to Your Agent (Grounding / RAG)</w:t>
+              <w:t>Lab 7B: Ground the IT Support agent — FAQ RAG, citations and evaluation</w:t>
             </w:r>
           </w:p>
         </w:tc>
@@ -2480,6 +2934,9 @@
         </w:tc>
       </w:tr>
       <w:tr>
+        <w:trPr>
+          <w:cantSplit/>
+        </w:trPr>
         <w:tc>
           <w:tcPr>
             <w:tcW w:type="dxa" w:w="1520"/>
@@ -2522,7 +2979,7 @@
                 <w:b/>
                 <w:sz w:val="19"/>
               </w:rPr>
-              <w:t>Lab 8: Add Tools and Actions — connectors &amp; flows as tools</w:t>
+              <w:t>Lab 8: Deploy the shared Marina Trust agent to Teams and connect the website HTTP flow</w:t>
             </w:r>
           </w:p>
         </w:tc>
@@ -2558,6 +3015,9 @@
         </w:tc>
       </w:tr>
       <w:tr>
+        <w:trPr>
+          <w:cantSplit/>
+        </w:trPr>
         <w:tc>
           <w:tcPr>
             <w:tcW w:type="dxa" w:w="1520"/>
@@ -2635,6 +3095,9 @@
         </w:tc>
       </w:tr>
       <w:tr>
+        <w:trPr>
+          <w:cantSplit/>
+        </w:trPr>
         <w:tc>
           <w:tcPr>
             <w:tcW w:type="dxa" w:w="1520"/>
@@ -2677,7 +3140,7 @@
                 <w:b/>
                 <w:sz w:val="19"/>
               </w:rPr>
-              <w:t>Lab 9: Sales Enquiry Assistant — capture structured data</w:t>
+              <w:t>Lab 9: Teams + Website Agent Flow — both chatbot channels call a deterministic agent flow</w:t>
             </w:r>
           </w:p>
         </w:tc>
@@ -2713,6 +3176,9 @@
         </w:tc>
       </w:tr>
       <w:tr>
+        <w:trPr>
+          <w:cantSplit/>
+        </w:trPr>
         <w:tc>
           <w:tcPr>
             <w:tcW w:type="dxa" w:w="1520"/>
@@ -2755,7 +3221,7 @@
                 <w:b/>
                 <w:sz w:val="19"/>
               </w:rPr>
-              <w:t>Lab 10: Procurement Request Workflow — agent calls a flow, log + notify, test end-to-end</w:t>
+              <w:t>Lab 10: Teams + Website Prompt Flow — both chatbot channels call a guarded AI Builder prompt flow</w:t>
             </w:r>
           </w:p>
         </w:tc>
@@ -2791,6 +3257,9 @@
         </w:tc>
       </w:tr>
       <w:tr>
+        <w:trPr>
+          <w:cantSplit/>
+        </w:trPr>
         <w:tc>
           <w:tcPr>
             <w:tcW w:type="dxa" w:w="1520"/>
@@ -2868,84 +3337,9 @@
         </w:tc>
       </w:tr>
       <w:tr>
-        <w:tc>
-          <w:tcPr>
-            <w:tcW w:type="dxa" w:w="1520"/>
-            <w:shd w:val="clear" w:color="auto" w:fill="E8F7EE"/>
-          </w:tcPr>
-          <w:p>
-            <w:r/>
-            <w:r>
-              <w:rPr>
-                <w:sz w:val="19"/>
-              </w:rPr>
-              <w:t>3:00 – 3:30</w:t>
-            </w:r>
-          </w:p>
-        </w:tc>
-        <w:tc>
-          <w:tcPr>
-            <w:tcW w:type="dxa" w:w="1000"/>
-            <w:shd w:val="clear" w:color="auto" w:fill="E8F7EE"/>
-          </w:tcPr>
-          <w:p>
-            <w:r/>
-            <w:r>
-              <w:rPr>
-                <w:sz w:val="19"/>
-              </w:rPr>
-              <w:t>30 min</w:t>
-            </w:r>
-          </w:p>
-        </w:tc>
-        <w:tc>
-          <w:tcPr>
-            <w:tcW w:type="dxa" w:w="1728"/>
-            <w:shd w:val="clear" w:color="auto" w:fill="E8F7EE"/>
-          </w:tcPr>
-          <w:p>
-            <w:r/>
-            <w:r>
-              <w:rPr>
-                <w:b/>
-                <w:sz w:val="19"/>
-              </w:rPr>
-              <w:t>Lab 11: Automated Response Generation (AI prompts)</w:t>
-            </w:r>
-          </w:p>
-        </w:tc>
-        <w:tc>
-          <w:tcPr>
-            <w:tcW w:type="dxa" w:w="1760"/>
-            <w:shd w:val="clear" w:color="auto" w:fill="E8F7EE"/>
-          </w:tcPr>
-          <w:p>
-            <w:r/>
-            <w:r>
-              <w:rPr>
-                <w:sz w:val="19"/>
-              </w:rPr>
-              <w:t>Hands-on lab</w:t>
-            </w:r>
-          </w:p>
-        </w:tc>
-        <w:tc>
-          <w:tcPr>
-            <w:tcW w:type="dxa" w:w="1120"/>
-            <w:shd w:val="clear" w:color="auto" w:fill="E8F7EE"/>
-          </w:tcPr>
-          <w:p>
-            <w:r/>
-            <w:r>
-              <w:rPr>
-                <w:sz w:val="19"/>
-              </w:rPr>
-              <w:t>71–72</w:t>
-            </w:r>
-          </w:p>
-        </w:tc>
-      </w:tr>
-      <w:tr>
+        <w:trPr>
+          <w:cantSplit/>
+        </w:trPr>
         <w:tc>
           <w:tcPr>
             <w:tcW w:type="dxa" w:w="1520"/>
@@ -2957,7 +3351,7 @@
               <w:rPr>
                 <w:sz w:val="19"/>
               </w:rPr>
-              <w:t>3:30 – 4:00</w:t>
+              <w:t>3:00 – 4:00</w:t>
             </w:r>
           </w:p>
         </w:tc>
@@ -2972,7 +3366,7 @@
               <w:rPr>
                 <w:sz w:val="19"/>
               </w:rPr>
-              <w:t>30 min</w:t>
+              <w:t>60 min</w:t>
             </w:r>
           </w:p>
         </w:tc>
@@ -2988,7 +3382,7 @@
                 <w:b/>
                 <w:sz w:val="19"/>
               </w:rPr>
-              <w:t>Testing &amp; debugging agents, Day 2 recap, course wrap-up &amp; briefing for assessment</w:t>
+              <w:t>Integrated testing: compare HTTP, agent and prompt flows; troubleshoot Teams/website channels; Day 2 recap and assessment briefing</w:t>
             </w:r>
           </w:p>
         </w:tc>
@@ -3018,12 +3412,15 @@
               <w:rPr>
                 <w:sz w:val="19"/>
               </w:rPr>
-              <w:t>72–85</w:t>
+              <w:t>71–85</w:t>
             </w:r>
           </w:p>
         </w:tc>
       </w:tr>
       <w:tr>
+        <w:trPr>
+          <w:cantSplit/>
+        </w:trPr>
         <w:tc>
           <w:tcPr>
             <w:tcW w:type="dxa" w:w="1520"/>
@@ -3102,6 +3499,9 @@
         </w:tc>
       </w:tr>
       <w:tr>
+        <w:trPr>
+          <w:cantSplit/>
+        </w:trPr>
         <w:tc>
           <w:tcPr>
             <w:tcW w:type="dxa" w:w="1520"/>
@@ -3456,7 +3856,7 @@
     </w:p>
     <w:p>
       <w:r>
-        <w:t>Formative assessment is continuous: each lab includes a Checkpoint that the facilitator verifies before the class moves on, and Lab 10 (Procurement Request Workflow) serves as the integrative check that a participant can wire an agent to a flow end-to-end ahead of the Practical Performance assessment.</w:t>
+        <w:t>Formative assessment is continuous: each lab includes a Checkpoint that the facilitator verifies before the class moves on. Labs 8–10 progressively verify an ordinary HTTP flow, a deterministic agent flow, and a guarded prompt flow across Microsoft Teams and website channels.</w:t>
       </w:r>
     </w:p>
     <w:sectPr>

</xml_diff>